<commit_message>
Add ComfyUI Manager security restriction documentation
Addresses user-reported error:
'This action is not allowed with this security level configuration'

Changes:
- Added Quick Fix section at top for common errors
- Documented security restriction when entering git URLs
- Clarified to use search function instead of manual URLs
- Added search tips: 'controlnet aux' for MeshGraphormer
- Reorganized guide with two main problems:
  1. ComfyUI Manager security restriction
  2. Git authentication issues

Updated files:
- INSTALLATION_TROUBLESHOOTING.md/.docx

This helps users understand why manual URL entry fails
and provides clear alternative solutions.
</commit_message>
<xml_diff>
--- a/INSTALLATION_TROUBLESHOOTING.docx
+++ b/INSTALLATION_TROUBLESHOOTING.docx
@@ -11,7 +11,7 @@
           <w:color w:val="003366"/>
           <w:sz w:val="48"/>
         </w:rPr>
-        <w:t>Installation Troubleshooting: Git Authentication Issues</w:t>
+        <w:t>Installation Troubleshooting Guide</w:t>
       </w:r>
     </w:p>
     <w:p/>
@@ -20,7 +20,7 @@
         <w:rPr>
           <w:b/>
         </w:rPr>
-        <w:t>If git clone asks for username/password, use one of these alternative methods:</w:t>
+        <w:t>Common installation issues and their solutions</w:t>
       </w:r>
     </w:p>
     <w:p/>
@@ -39,7 +39,246 @@
           <w:color w:val="0066CC"/>
           <w:sz w:val="36"/>
         </w:rPr>
-        <w:t>Problem: Git Clone Requests Authentication</w:t>
+        <w:t>Quick Fix for Common Errors</w:t>
+      </w:r>
+    </w:p>
+    <w:p/>
+    <w:p>
+      <w:pPr>
+        <w:pStyle w:val="Heading2"/>
+      </w:pPr>
+      <w:r>
+        <w:rPr>
+          <w:color w:val="336699"/>
+          <w:sz w:val="28"/>
+        </w:rPr>
+        <w:t>Error 1: "This action is not allowed with this security level configuration"</w:t>
+      </w:r>
+    </w:p>
+    <w:p>
+      <w:r>
+        <w:rPr>
+          <w:b/>
+        </w:rPr>
+        <w:t>Where:</w:t>
+      </w:r>
+      <w:r>
+        <w:t xml:space="preserve"> ComfyUI Manager when trying to enter git URL</w:t>
+      </w:r>
+    </w:p>
+    <w:p/>
+    <w:p>
+      <w:r>
+        <w:rPr>
+          <w:b/>
+        </w:rPr>
+        <w:t>Solution:</w:t>
+      </w:r>
+    </w:p>
+    <w:p>
+      <w:pPr>
+        <w:pStyle w:val="ListBullet"/>
+      </w:pPr>
+      <w:r>
+        <w:t xml:space="preserve">✅ </w:t>
+      </w:r>
+      <w:r>
+        <w:rPr>
+          <w:b/>
+        </w:rPr>
+        <w:t>Use the search box</w:t>
+      </w:r>
+      <w:r>
+        <w:t xml:space="preserve"> in ComfyUI Manager instead of entering URLs</w:t>
+      </w:r>
+    </w:p>
+    <w:p>
+      <w:pPr>
+        <w:pStyle w:val="ListBullet"/>
+      </w:pPr>
+      <w:r>
+        <w:t>✅ Search for "controlnet aux" to find MeshGraphormer</w:t>
+      </w:r>
+    </w:p>
+    <w:p>
+      <w:pPr>
+        <w:pStyle w:val="ListBullet"/>
+      </w:pPr>
+      <w:r>
+        <w:t>✅ Or use Manual Download method (see Solution 2 below)</w:t>
+      </w:r>
+    </w:p>
+    <w:p/>
+    <w:p>
+      <w:pPr>
+        <w:pStyle w:val="Heading2"/>
+      </w:pPr>
+      <w:r>
+        <w:rPr>
+          <w:color w:val="336699"/>
+          <w:sz w:val="28"/>
+        </w:rPr>
+        <w:t>Error 2: Git Clone Asks for Username/Password</w:t>
+      </w:r>
+    </w:p>
+    <w:p>
+      <w:r>
+        <w:rPr>
+          <w:b/>
+        </w:rPr>
+        <w:t>Where:</w:t>
+      </w:r>
+      <w:r>
+        <w:t xml:space="preserve"> Terminal/command line when running </w:t>
+      </w:r>
+      <w:r>
+        <w:rPr>
+          <w:rFonts w:ascii="Courier New" w:hAnsi="Courier New"/>
+          <w:color w:val="C7254E"/>
+          <w:sz w:val="20"/>
+        </w:rPr>
+        <w:t>git clone</w:t>
+      </w:r>
+    </w:p>
+    <w:p/>
+    <w:p>
+      <w:r>
+        <w:rPr>
+          <w:b/>
+        </w:rPr>
+        <w:t>Solution:</w:t>
+      </w:r>
+    </w:p>
+    <w:p>
+      <w:pPr>
+        <w:pStyle w:val="ListBullet"/>
+      </w:pPr>
+      <w:r>
+        <w:t xml:space="preserve">✅ </w:t>
+      </w:r>
+      <w:r>
+        <w:rPr>
+          <w:b/>
+        </w:rPr>
+        <w:t>Use ComfyUI Manager search</w:t>
+      </w:r>
+      <w:r>
+        <w:t xml:space="preserve"> (easiest - see Solution 1)</w:t>
+      </w:r>
+    </w:p>
+    <w:p>
+      <w:pPr>
+        <w:pStyle w:val="ListBullet"/>
+      </w:pPr>
+      <w:r>
+        <w:t xml:space="preserve">✅ </w:t>
+      </w:r>
+      <w:r>
+        <w:rPr>
+          <w:b/>
+        </w:rPr>
+        <w:t>Download ZIP manually</w:t>
+      </w:r>
+      <w:r>
+        <w:t xml:space="preserve"> from GitHub (see Solution 2)</w:t>
+      </w:r>
+    </w:p>
+    <w:p>
+      <w:pPr>
+        <w:pStyle w:val="ListBullet"/>
+      </w:pPr>
+      <w:r>
+        <w:t>✅ Skip git entirely (see Solutions 1 &amp; 2)</w:t>
+      </w:r>
+    </w:p>
+    <w:p/>
+    <w:p>
+      <w:r>
+        <w:t>________________________________________________________________________________</w:t>
+      </w:r>
+    </w:p>
+    <w:p/>
+    <w:p>
+      <w:pPr>
+        <w:pStyle w:val="Heading1"/>
+      </w:pPr>
+      <w:r>
+        <w:rPr>
+          <w:color w:val="0066CC"/>
+          <w:sz w:val="36"/>
+        </w:rPr>
+        <w:t>Problem 1: ComfyUI Manager Security Restriction</w:t>
+      </w:r>
+    </w:p>
+    <w:p/>
+    <w:p>
+      <w:r>
+        <w:t>When trying to install custom nodes by entering a git URL in ComfyUI Manager, you see:</w:t>
+      </w:r>
+    </w:p>
+    <w:p>
+      <w:pPr>
+        <w:ind w:left="360" w:right="360"/>
+      </w:pPr>
+      <w:r>
+        <w:rPr>
+          <w:rFonts w:ascii="Courier New" w:hAnsi="Courier New"/>
+          <w:color w:val="000000"/>
+          <w:sz w:val="18"/>
+        </w:rPr>
+        <w:t>"This action is not allowed with this security level configuration."</w:t>
+      </w:r>
+    </w:p>
+    <w:p/>
+    <w:p>
+      <w:r>
+        <w:rPr>
+          <w:b/>
+        </w:rPr>
+        <w:t>This is a security feature</w:t>
+      </w:r>
+      <w:r>
+        <w:t xml:space="preserve"> that restricts manual URL entry. You can only install nodes from the Manager's official trusted list.</w:t>
+      </w:r>
+    </w:p>
+    <w:p/>
+    <w:p>
+      <w:r>
+        <w:rPr>
+          <w:b/>
+        </w:rPr>
+        <w:t>Solution:</w:t>
+      </w:r>
+      <w:r>
+        <w:t xml:space="preserve"> Jump to [Solution 1](#solution-1-use-comfyui-manager-easiest---recommended) and use the </w:t>
+      </w:r>
+      <w:r>
+        <w:rPr>
+          <w:b/>
+        </w:rPr>
+        <w:t>search function</w:t>
+      </w:r>
+      <w:r>
+        <w:t xml:space="preserve"> instead of entering URLs.</w:t>
+      </w:r>
+    </w:p>
+    <w:p/>
+    <w:p>
+      <w:r>
+        <w:t>________________________________________________________________________________</w:t>
+      </w:r>
+    </w:p>
+    <w:p/>
+    <w:p>
+      <w:pPr>
+        <w:pStyle w:val="Heading1"/>
+      </w:pPr>
+      <w:r>
+        <w:rPr>
+          <w:color w:val="0066CC"/>
+          <w:sz w:val="36"/>
+        </w:rPr>
+        <w:t>Problem 2: Git Clone Requests Authentication</w:t>
       </w:r>
     </w:p>
     <w:p/>
@@ -212,6 +451,15 @@
     </w:p>
     <w:p/>
     <w:p>
+      <w:r>
+        <w:rPr>
+          <w:b/>
+        </w:rPr>
+        <w:t>IMPORTANT: Use the search function, don't enter git URLs directly!</w:t>
+      </w:r>
+    </w:p>
+    <w:p/>
+    <w:p>
       <w:pPr>
         <w:pStyle w:val="ListNumber"/>
       </w:pPr>
@@ -253,7 +501,13 @@
         <w:pStyle w:val="ListNumber"/>
       </w:pPr>
       <w:r>
-        <w:t>Search for the node you need:</w:t>
+        <w:rPr>
+          <w:b/>
+        </w:rPr>
+        <w:t>Use the search box</w:t>
+      </w:r>
+      <w:r>
+        <w:t xml:space="preserve"> to find nodes:</w:t>
       </w:r>
     </w:p>
     <w:p>
@@ -261,7 +515,25 @@
         <w:pStyle w:val="ListBullet"/>
       </w:pPr>
       <w:r>
-        <w:t>Search "MeshGraphormer" → Click "Install"</w:t>
+        <w:t>Search "</w:t>
+      </w:r>
+      <w:r>
+        <w:rPr>
+          <w:b/>
+        </w:rPr>
+        <w:t>ControlNet Auxiliary</w:t>
+      </w:r>
+      <w:r>
+        <w:t>" or "</w:t>
+      </w:r>
+      <w:r>
+        <w:rPr>
+          <w:b/>
+        </w:rPr>
+        <w:t>controlnet aux</w:t>
+      </w:r>
+      <w:r>
+        <w:t>" → Find "ComfyUI's ControlNet Auxiliary Preprocessors" → Click "Install"</w:t>
       </w:r>
     </w:p>
     <w:p>
@@ -269,7 +541,16 @@
         <w:pStyle w:val="ListBullet"/>
       </w:pPr>
       <w:r>
-        <w:t>Search "BMAB" → Click "Install"</w:t>
+        <w:t>Search "</w:t>
+      </w:r>
+      <w:r>
+        <w:rPr>
+          <w:b/>
+        </w:rPr>
+        <w:t>BMAB</w:t>
+      </w:r>
+      <w:r>
+        <w:t>" → Click "Install"</w:t>
       </w:r>
     </w:p>
     <w:p>
@@ -277,7 +558,16 @@
         <w:pStyle w:val="ListBullet"/>
       </w:pPr>
       <w:r>
-        <w:t>Search "SAM2" → Click "Install"</w:t>
+        <w:t>Search "</w:t>
+      </w:r>
+      <w:r>
+        <w:rPr>
+          <w:b/>
+        </w:rPr>
+        <w:t>SAM2</w:t>
+      </w:r>
+      <w:r>
+        <w:t>" → Click "Install"</w:t>
       </w:r>
     </w:p>
     <w:p>
@@ -294,6 +584,154 @@
       </w:pPr>
       <w:r>
         <w:t>Restart ComfyUI when prompted</w:t>
+      </w:r>
+    </w:p>
+    <w:p/>
+    <w:p>
+      <w:r>
+        <w:rPr>
+          <w:b/>
+        </w:rPr>
+        <w:t>⚠️ Security Restriction Warning</w:t>
+      </w:r>
+    </w:p>
+    <w:p/>
+    <w:p>
+      <w:r>
+        <w:t xml:space="preserve">If you try to </w:t>
+      </w:r>
+      <w:r>
+        <w:rPr>
+          <w:b/>
+        </w:rPr>
+        <w:t>manually enter a git URL</w:t>
+      </w:r>
+      <w:r>
+        <w:t xml:space="preserve"> in ComfyUI Manager, you may see:</w:t>
+      </w:r>
+    </w:p>
+    <w:p>
+      <w:pPr>
+        <w:ind w:left="360" w:right="360"/>
+      </w:pPr>
+      <w:r>
+        <w:rPr>
+          <w:rFonts w:ascii="Courier New" w:hAnsi="Courier New"/>
+          <w:color w:val="000000"/>
+          <w:sz w:val="18"/>
+        </w:rPr>
+        <w:t>"This action is not allowed with this security level configuration."</w:t>
+      </w:r>
+    </w:p>
+    <w:p/>
+    <w:p>
+      <w:r>
+        <w:rPr>
+          <w:b/>
+        </w:rPr>
+        <w:t>Solution:</w:t>
+      </w:r>
+    </w:p>
+    <w:p>
+      <w:pPr>
+        <w:pStyle w:val="ListBullet"/>
+      </w:pPr>
+      <w:r>
+        <w:t xml:space="preserve">✅ </w:t>
+      </w:r>
+      <w:r>
+        <w:rPr>
+          <w:b/>
+        </w:rPr>
+        <w:t>Use the search function</w:t>
+      </w:r>
+      <w:r>
+        <w:t xml:space="preserve"> instead of entering URLs</w:t>
+      </w:r>
+    </w:p>
+    <w:p>
+      <w:pPr>
+        <w:pStyle w:val="ListBullet"/>
+      </w:pPr>
+      <w:r>
+        <w:t>✅ The node must be in Manager's official list to install this way</w:t>
+      </w:r>
+    </w:p>
+    <w:p>
+      <w:pPr>
+        <w:pStyle w:val="ListBullet"/>
+      </w:pPr>
+      <w:r>
+        <w:t xml:space="preserve">✅ If not found in search, use </w:t>
+      </w:r>
+      <w:r>
+        <w:rPr>
+          <w:b/>
+        </w:rPr>
+        <w:t>Manual Download</w:t>
+      </w:r>
+      <w:r>
+        <w:t xml:space="preserve"> (Solution 2 below)</w:t>
+      </w:r>
+    </w:p>
+    <w:p/>
+    <w:p>
+      <w:r>
+        <w:rPr>
+          <w:b/>
+        </w:rPr>
+        <w:t>How to search effectively:</w:t>
+      </w:r>
+    </w:p>
+    <w:p>
+      <w:pPr>
+        <w:pStyle w:val="ListBullet"/>
+      </w:pPr>
+      <w:r>
+        <w:t>For MeshGraphormer: Search "</w:t>
+      </w:r>
+      <w:r>
+        <w:rPr>
+          <w:b/>
+        </w:rPr>
+        <w:t>controlnet aux</w:t>
+      </w:r>
+      <w:r>
+        <w:t>" or "</w:t>
+      </w:r>
+      <w:r>
+        <w:rPr>
+          <w:b/>
+        </w:rPr>
+        <w:t>auxiliary</w:t>
+      </w:r>
+      <w:r>
+        <w:t>"</w:t>
+      </w:r>
+    </w:p>
+    <w:p>
+      <w:pPr>
+        <w:pStyle w:val="ListBullet"/>
+      </w:pPr>
+      <w:r>
+        <w:t>For Impact Pack nodes: Search "</w:t>
+      </w:r>
+      <w:r>
+        <w:rPr>
+          <w:b/>
+        </w:rPr>
+        <w:t>impact</w:t>
+      </w:r>
+      <w:r>
+        <w:t>"</w:t>
+      </w:r>
+    </w:p>
+    <w:p>
+      <w:pPr>
+        <w:pStyle w:val="ListBullet"/>
+      </w:pPr>
+      <w:r>
+        <w:t>Use partial names if full name doesn't work</w:t>
       </w:r>
     </w:p>
     <w:p/>
@@ -335,6 +773,14 @@
       </w:pPr>
       <w:r>
         <w:t>✅ Easy updates through GUI</w:t>
+      </w:r>
+    </w:p>
+    <w:p>
+      <w:pPr>
+        <w:pStyle w:val="ListBullet"/>
+      </w:pPr>
+      <w:r>
+        <w:t>✅ Only nodes from trusted sources</w:t>
       </w:r>
     </w:p>
     <w:p/>

</xml_diff>